<commit_message>
docs: add white-box test documentation for UC07 and UC08 and update UC06 tests
</commit_message>
<xml_diff>
--- a/hop-trang/KiemThuHopTrang_UC06_UploadCV.docx
+++ b/hop-trang/KiemThuHopTrang_UC06_UploadCV.docx
@@ -7958,7 +7958,7 @@
           <w:rFonts w:ascii="Arial" w:hAnsi="Arial"/>
           <w:sz w:val="21"/>
         </w:rPr>
-        <w:t xml:space="preserve">    Start([Bắt đầu: execute]) --&gt; N1[Node 1: if !cvFile]</w:t>
+        <w:t xml:space="preserve">    Start(["Bắt đầu: execute"]) --&gt; N1["Node 1: if (!cvFile)"]</w:t>
       </w:r>
       <w:r>
         <w:rPr>
@@ -7973,7 +7973,7 @@
           <w:rFonts w:ascii="Arial" w:hAnsi="Arial"/>
           <w:sz w:val="21"/>
         </w:rPr>
-        <w:t xml:space="preserve">    N1 -- True --&gt; N2[Node 2: throw 'No file uploaded']</w:t>
+        <w:t xml:space="preserve">    N1 -- True --&gt; N2["Node 2: throw 'No file uploaded'"]</w:t>
       </w:r>
       <w:r>
         <w:rPr>
@@ -7988,7 +7988,7 @@
           <w:rFonts w:ascii="Arial" w:hAnsi="Arial"/>
           <w:sz w:val="21"/>
         </w:rPr>
-        <w:t xml:space="preserve">    N1 -- False --&gt; N3[Node 3: getById job, if !job]</w:t>
+        <w:t xml:space="preserve">    N1 -- False --&gt; N3["Node 3: getById(jobID), if (!job)"]</w:t>
       </w:r>
       <w:r>
         <w:rPr>
@@ -8018,7 +8018,7 @@
           <w:rFonts w:ascii="Arial" w:hAnsi="Arial"/>
           <w:sz w:val="21"/>
         </w:rPr>
-        <w:t xml:space="preserve">    N3 -- True --&gt; N4[Node 4: throw 'Công việc không đúng']</w:t>
+        <w:t xml:space="preserve">    N3 -- True --&gt; N4["Node 4: throw 'Công việc không đúng'"]</w:t>
       </w:r>
       <w:r>
         <w:rPr>
@@ -8033,7 +8033,7 @@
           <w:rFonts w:ascii="Arial" w:hAnsi="Arial"/>
           <w:sz w:val="21"/>
         </w:rPr>
-        <w:t xml:space="preserve">    N3 -- False --&gt; N5[Node 5: files=[cvFile], if avatarFile]</w:t>
+        <w:t xml:space="preserve">    N3 -- False --&gt; N5["Node 5: files = [cvFile], if (avatarFile)"]</w:t>
       </w:r>
       <w:r>
         <w:rPr>
@@ -8063,7 +8063,7 @@
           <w:rFonts w:ascii="Arial" w:hAnsi="Arial"/>
           <w:sz w:val="21"/>
         </w:rPr>
-        <w:t xml:space="preserve">    N5 -- True --&gt; N6[Node 6: files.push avatarFile]</w:t>
+        <w:t xml:space="preserve">    N5 -- True --&gt; N6["Node 6: files.push(avatarFile)"]</w:t>
       </w:r>
       <w:r>
         <w:rPr>
@@ -8078,7 +8078,7 @@
           <w:rFonts w:ascii="Arial" w:hAnsi="Arial"/>
           <w:sz w:val="21"/>
         </w:rPr>
-        <w:t xml:space="preserve">    N5 -- False --&gt; N7</w:t>
+        <w:t xml:space="preserve">    N5 -- False --&gt; N7["Node 7: uploadCloud, if (!fileUrls || len === 0)"]</w:t>
       </w:r>
       <w:r>
         <w:rPr>
@@ -8093,7 +8093,7 @@
           <w:rFonts w:ascii="Arial" w:hAnsi="Arial"/>
           <w:sz w:val="21"/>
         </w:rPr>
-        <w:t xml:space="preserve">    N6 --&gt; N7[Node 7: uploadCloud, if !fileUrls || len==0]</w:t>
+        <w:t xml:space="preserve">    N6 --&gt; N7</w:t>
       </w:r>
       <w:r>
         <w:rPr>
@@ -8123,7 +8123,7 @@
           <w:rFonts w:ascii="Arial" w:hAnsi="Arial"/>
           <w:sz w:val="21"/>
         </w:rPr>
-        <w:t xml:space="preserve">    N7 -- True --&gt; N8[Node 8: throw 'Upload CV thất bại']</w:t>
+        <w:t xml:space="preserve">    N7 -- True --&gt; N8["Node 8: throw 'Upload CV thất bại'"]</w:t>
       </w:r>
       <w:r>
         <w:rPr>
@@ -8138,7 +8138,7 @@
           <w:rFonts w:ascii="Arial" w:hAnsi="Arial"/>
           <w:sz w:val="21"/>
         </w:rPr>
-        <w:t xml:space="preserve">    N7 -- False --&gt; N9[Node 9: cvLink, avatarLink, if isPDF || isImage]</w:t>
+        <w:t xml:space="preserve">    N7 -- False --&gt; N9["Node 9: cvLink, avatarLink, if isPDF || isImage"]</w:t>
       </w:r>
       <w:r>
         <w:rPr>
@@ -8168,7 +8168,7 @@
           <w:rFonts w:ascii="Arial" w:hAnsi="Arial"/>
           <w:sz w:val="21"/>
         </w:rPr>
-        <w:t xml:space="preserve">    N9 -- True --&gt; N10[Node 10: extractCV Gemini]</w:t>
+        <w:t xml:space="preserve">    N9 -- True --&gt; N10["Node 10: extractCV Gemini"]</w:t>
       </w:r>
       <w:r>
         <w:rPr>
@@ -8183,7 +8183,7 @@
           <w:rFonts w:ascii="Arial" w:hAnsi="Arial"/>
           <w:sz w:val="21"/>
         </w:rPr>
-        <w:t xml:space="preserve">    N9 -- False --&gt; N11</w:t>
+        <w:t xml:space="preserve">    N9 -- False --&gt; N11["Node 11: get email, if (!email)"]</w:t>
       </w:r>
       <w:r>
         <w:rPr>
@@ -8198,7 +8198,7 @@
           <w:rFonts w:ascii="Arial" w:hAnsi="Arial"/>
           <w:sz w:val="21"/>
         </w:rPr>
-        <w:t xml:space="preserve">    N10 --&gt; N11[Node 11: get email, if !email]</w:t>
+        <w:t xml:space="preserve">    N10 --&gt; N11</w:t>
       </w:r>
       <w:r>
         <w:rPr>
@@ -8228,7 +8228,7 @@
           <w:rFonts w:ascii="Arial" w:hAnsi="Arial"/>
           <w:sz w:val="21"/>
         </w:rPr>
-        <w:t xml:space="preserve">    N11 -- True --&gt; N12[Node 12: throw 'không thể trích xuất Email']</w:t>
+        <w:t xml:space="preserve">    N11 -- True --&gt; N12["Node 12: throw 'không thể trích xuất Email'"]</w:t>
       </w:r>
       <w:r>
         <w:rPr>
@@ -8243,7 +8243,7 @@
           <w:rFonts w:ascii="Arial" w:hAnsi="Arial"/>
           <w:sz w:val="21"/>
         </w:rPr>
-        <w:t xml:space="preserve">    N11 -- False --&gt; N13[Node 13: findByEmail, if candidate]</w:t>
+        <w:t xml:space="preserve">    N11 -- False --&gt; N13["Node 13: findByEmail, if (candidate)"]</w:t>
       </w:r>
       <w:r>
         <w:rPr>
@@ -8273,7 +8273,7 @@
           <w:rFonts w:ascii="Arial" w:hAnsi="Arial"/>
           <w:sz w:val="21"/>
         </w:rPr>
-        <w:t xml:space="preserve">    N13 -- True --&gt; N14[Node 14: update candidate]</w:t>
+        <w:t xml:space="preserve">    N13 -- True --&gt; N14["Node 14: update candidate"]</w:t>
       </w:r>
       <w:r>
         <w:rPr>
@@ -8288,7 +8288,7 @@
           <w:rFonts w:ascii="Arial" w:hAnsi="Arial"/>
           <w:sz w:val="21"/>
         </w:rPr>
-        <w:t xml:space="preserve">    N13 -- False --&gt; N15[Node 15: create candidate]</w:t>
+        <w:t xml:space="preserve">    N13 -- False --&gt; N15["Node 15: create candidate"]</w:t>
       </w:r>
       <w:r>
         <w:rPr>
@@ -8318,7 +8318,7 @@
           <w:rFonts w:ascii="Arial" w:hAnsi="Arial"/>
           <w:sz w:val="21"/>
         </w:rPr>
-        <w:t xml:space="preserve">    N14 --&gt; N16[Node 16: if !newCandidate]</w:t>
+        <w:t xml:space="preserve">    N14 --&gt; N16["Node 16: if (!newCandidate)"]</w:t>
       </w:r>
       <w:r>
         <w:rPr>
@@ -8363,7 +8363,7 @@
           <w:rFonts w:ascii="Arial" w:hAnsi="Arial"/>
           <w:sz w:val="21"/>
         </w:rPr>
-        <w:t xml:space="preserve">    N16 -- True --&gt; N17[Node 17: throw 'Lưu hồ sơ thất bại']</w:t>
+        <w:t xml:space="preserve">    N16 -- True --&gt; N17["Node 17: throw 'Lưu hồ sơ thất bại'"]</w:t>
       </w:r>
       <w:r>
         <w:rPr>
@@ -8378,7 +8378,7 @@
           <w:rFonts w:ascii="Arial" w:hAnsi="Arial"/>
           <w:sz w:val="21"/>
         </w:rPr>
-        <w:t xml:space="preserve">    N16 -- False --&gt; N18[Node 18: return candidate profile]</w:t>
+        <w:t xml:space="preserve">    N16 -- False --&gt; N18["Node 18: return candidate profile"]</w:t>
       </w:r>
     </w:p>
     <w:p>

</xml_diff>

<commit_message>
docs: update white-box testing documentation for UC06, UC07, and UC08
</commit_message>
<xml_diff>
--- a/hop-trang/KiemThuHopTrang_UC06_UploadCV.docx
+++ b/hop-trang/KiemThuHopTrang_UC06_UploadCV.docx
@@ -7712,7 +7712,7 @@
           <w:rFonts w:ascii="Times New Roman" w:hAnsi="Times New Roman"/>
           <w:sz w:val="22"/>
         </w:rPr>
-        <w:t xml:space="preserve">flowchart TD</w:t>
+        <w:t xml:space="preserve">flowchart LR</w:t>
       </w:r>
       <w:r>
         <w:rPr>
@@ -7727,7 +7727,7 @@
           <w:rFonts w:ascii="Times New Roman" w:hAnsi="Times New Roman"/>
           <w:sz w:val="22"/>
         </w:rPr>
-        <w:t xml:space="preserve">    Start(["Bắt đầu: execute"]) --&gt; N1["Node 1: if (!cvFile)"]</w:t>
+        <w:t xml:space="preserve">    Start(["Bắt đầu: execute"]) --&gt; N1{"Node 1: !cvFile?"}</w:t>
       </w:r>
       <w:r>
         <w:rPr>
@@ -7742,7 +7742,7 @@
           <w:rFonts w:ascii="Times New Roman" w:hAnsi="Times New Roman"/>
           <w:sz w:val="22"/>
         </w:rPr>
-        <w:t xml:space="preserve">    N1 -- True --&gt; N2["Node 2: throw 'No file uploaded'"]</w:t>
+        <w:t xml:space="preserve">    N1 -- "True" --&gt; N2["Node 2: throw 'No file uploaded'"]</w:t>
       </w:r>
       <w:r>
         <w:rPr>
@@ -7757,7 +7757,7 @@
           <w:rFonts w:ascii="Times New Roman" w:hAnsi="Times New Roman"/>
           <w:sz w:val="22"/>
         </w:rPr>
-        <w:t xml:space="preserve">    N1 -- False --&gt; N3["Node 3: getById(jobID), if (!job)"]</w:t>
+        <w:t xml:space="preserve">    N1 -- "False" --&gt; N3{"Node 3: !job?"}</w:t>
       </w:r>
       <w:r>
         <w:rPr>
@@ -7779,7 +7779,7 @@
           <w:rFonts w:ascii="Times New Roman" w:hAnsi="Times New Roman"/>
           <w:sz w:val="22"/>
         </w:rPr>
-        <w:t xml:space="preserve">    N3 -- True --&gt; N4["Node 4: throw 'Công việc không đúng'"]</w:t>
+        <w:t xml:space="preserve">    N3 -- "True" --&gt; N4["Node 4: throw 'Công việc không đúng'"]</w:t>
       </w:r>
       <w:r>
         <w:rPr>
@@ -7794,7 +7794,7 @@
           <w:rFonts w:ascii="Times New Roman" w:hAnsi="Times New Roman"/>
           <w:sz w:val="22"/>
         </w:rPr>
-        <w:t xml:space="preserve">    N3 -- False --&gt; N5["Node 5: files = [cvFile], if (avatarFile)"]</w:t>
+        <w:t xml:space="preserve">    N3 -- "False" --&gt; N5{"Node 5: avatarFile?"}</w:t>
       </w:r>
       <w:r>
         <w:rPr>
@@ -7816,7 +7816,7 @@
           <w:rFonts w:ascii="Times New Roman" w:hAnsi="Times New Roman"/>
           <w:sz w:val="22"/>
         </w:rPr>
-        <w:t xml:space="preserve">    N5 -- True --&gt; N6["Node 6: files.push(avatarFile)"]</w:t>
+        <w:t xml:space="preserve">    N5 -- "True" --&gt; N6["Node 6: files.push(avatarFile)"]</w:t>
       </w:r>
       <w:r>
         <w:rPr>
@@ -7831,7 +7831,7 @@
           <w:rFonts w:ascii="Times New Roman" w:hAnsi="Times New Roman"/>
           <w:sz w:val="22"/>
         </w:rPr>
-        <w:t xml:space="preserve">    N5 -- False --&gt; N7["Node 7: uploadCloud, if (!fileUrls || len === 0)"]</w:t>
+        <w:t xml:space="preserve">    N5 -- "False" --&gt; N7{"Node 7: !fileUrls || len==0?"}</w:t>
       </w:r>
       <w:r>
         <w:rPr>
@@ -7868,7 +7868,7 @@
           <w:rFonts w:ascii="Times New Roman" w:hAnsi="Times New Roman"/>
           <w:sz w:val="22"/>
         </w:rPr>
-        <w:t xml:space="preserve">    N7 -- True --&gt; N8["Node 8: throw 'Upload CV thất bại'"]</w:t>
+        <w:t xml:space="preserve">    N7 -- "True" --&gt; N8["Node 8: throw 'Upload CV thất bại'"]</w:t>
       </w:r>
       <w:r>
         <w:rPr>
@@ -7883,7 +7883,7 @@
           <w:rFonts w:ascii="Times New Roman" w:hAnsi="Times New Roman"/>
           <w:sz w:val="22"/>
         </w:rPr>
-        <w:t xml:space="preserve">    N7 -- False --&gt; N9["Node 9: cvLink, avatarLink, if isPDF || isImage"]</w:t>
+        <w:t xml:space="preserve">    N7 -- "False" --&gt; N9{"Node 9: isPDF || isImage?"}</w:t>
       </w:r>
       <w:r>
         <w:rPr>
@@ -7905,7 +7905,7 @@
           <w:rFonts w:ascii="Times New Roman" w:hAnsi="Times New Roman"/>
           <w:sz w:val="22"/>
         </w:rPr>
-        <w:t xml:space="preserve">    N9 -- True --&gt; N10["Node 10: extractCV Gemini"]</w:t>
+        <w:t xml:space="preserve">    N9 -- "True" --&gt; N10["Node 10: extractCV Gemini"]</w:t>
       </w:r>
       <w:r>
         <w:rPr>
@@ -7920,7 +7920,7 @@
           <w:rFonts w:ascii="Times New Roman" w:hAnsi="Times New Roman"/>
           <w:sz w:val="22"/>
         </w:rPr>
-        <w:t xml:space="preserve">    N9 -- False --&gt; N11["Node 11: get email, if (!email)"]</w:t>
+        <w:t xml:space="preserve">    N9 -- "False" --&gt; N11{"Node 11: !email?"}</w:t>
       </w:r>
       <w:r>
         <w:rPr>
@@ -7957,7 +7957,7 @@
           <w:rFonts w:ascii="Times New Roman" w:hAnsi="Times New Roman"/>
           <w:sz w:val="22"/>
         </w:rPr>
-        <w:t xml:space="preserve">    N11 -- True --&gt; N12["Node 12: throw 'không thể trích xuất Email'"]</w:t>
+        <w:t xml:space="preserve">    N11 -- "True" --&gt; N12["Node 12: throw 'Không có email'"]</w:t>
       </w:r>
       <w:r>
         <w:rPr>
@@ -7972,7 +7972,7 @@
           <w:rFonts w:ascii="Times New Roman" w:hAnsi="Times New Roman"/>
           <w:sz w:val="22"/>
         </w:rPr>
-        <w:t xml:space="preserve">    N11 -- False --&gt; N13["Node 13: findByEmail, if (candidate)"]</w:t>
+        <w:t xml:space="preserve">    N11 -- "False" --&gt; N13{"Node 13: candidate tồn tại?"}</w:t>
       </w:r>
       <w:r>
         <w:rPr>
@@ -7994,7 +7994,7 @@
           <w:rFonts w:ascii="Times New Roman" w:hAnsi="Times New Roman"/>
           <w:sz w:val="22"/>
         </w:rPr>
-        <w:t xml:space="preserve">    N13 -- True --&gt; N14["Node 14: update candidate"]</w:t>
+        <w:t xml:space="preserve">    N13 -- "True" --&gt; N14["Node 14: update candidate"]</w:t>
       </w:r>
       <w:r>
         <w:rPr>
@@ -8009,7 +8009,7 @@
           <w:rFonts w:ascii="Times New Roman" w:hAnsi="Times New Roman"/>
           <w:sz w:val="22"/>
         </w:rPr>
-        <w:t xml:space="preserve">    N13 -- False --&gt; N15["Node 15: create candidate"]</w:t>
+        <w:t xml:space="preserve">    N13 -- "False" --&gt; N15["Node 15: create candidate"]</w:t>
       </w:r>
       <w:r>
         <w:rPr>
@@ -8031,7 +8031,7 @@
           <w:rFonts w:ascii="Times New Roman" w:hAnsi="Times New Roman"/>
           <w:sz w:val="22"/>
         </w:rPr>
-        <w:t xml:space="preserve">    N14 --&gt; N16["Node 16: if (!newCandidate)"]</w:t>
+        <w:t xml:space="preserve">    N14 --&gt; N16{"Node 16: !newCandidate?"}</w:t>
       </w:r>
       <w:r>
         <w:rPr>
@@ -8068,7 +8068,7 @@
           <w:rFonts w:ascii="Times New Roman" w:hAnsi="Times New Roman"/>
           <w:sz w:val="22"/>
         </w:rPr>
-        <w:t xml:space="preserve">    N16 -- True --&gt; N17["Node 17: throw 'Lưu hồ sơ thất bại'"]</w:t>
+        <w:t xml:space="preserve">    N16 -- "True" --&gt; N17["Node 17: throw 'Lưu hồ sơ thất bại'"]</w:t>
       </w:r>
       <w:r>
         <w:rPr>
@@ -8083,7 +8083,7 @@
           <w:rFonts w:ascii="Times New Roman" w:hAnsi="Times New Roman"/>
           <w:sz w:val="22"/>
         </w:rPr>
-        <w:t xml:space="preserve">    N16 -- False --&gt; N18["Node 18: return candidate profile"]</w:t>
+        <w:t xml:space="preserve">    N16 -- "False" --&gt; N18["Node 18: return candidate profile"]</w:t>
       </w:r>
     </w:p>
     <w:bookmarkEnd w:id="13"/>
@@ -8468,7 +8468,7 @@
           <w:rFonts w:ascii="Times New Roman" w:hAnsi="Times New Roman"/>
           <w:sz w:val="22"/>
         </w:rPr>
-        <w:t xml:space="preserve">flowchart TD</w:t>
+        <w:t xml:space="preserve">flowchart LR</w:t>
       </w:r>
       <w:r>
         <w:rPr>
@@ -8639,7 +8639,7 @@
           <w:rFonts w:ascii="Times New Roman" w:hAnsi="Times New Roman"/>
           <w:sz w:val="22"/>
         </w:rPr>
-        <w:t xml:space="preserve">    N7a -- "False" --&gt; N7b{"Node 7b: fileUrls.len == 0?"}</w:t>
+        <w:t xml:space="preserve">    N7a -- "False" --&gt; N7b{"Node 7b: len == 0?"}</w:t>
       </w:r>
       <w:r>
         <w:rPr>
@@ -8773,7 +8773,7 @@
           <w:rFonts w:ascii="Times New Roman" w:hAnsi="Times New Roman"/>
           <w:sz w:val="22"/>
         </w:rPr>
-        <w:t xml:space="preserve">    N11 -- "True" --&gt; N12["Node 12: throw 'không thể trích xuất Email'"]</w:t>
+        <w:t xml:space="preserve">    N11 -- "True" --&gt; N12["Node 12: throw 'Không có email'"]</w:t>
       </w:r>
       <w:r>
         <w:rPr>

</xml_diff>